<commit_message>
cv: add portfolio amnhmb.my to header + closing CTA
</commit_message>
<xml_diff>
--- a/public/Aiman_Hambali_CV.docx
+++ b/public/Aiman_Hambali_CV.docx
@@ -24,7 +24,7 @@
         <w:br/>
       </w:r>
       <w:r>
-        <w:t>aimannhambalii@gmail.com | WhatsApp: +60 11-2550 7190 | Kota Bharu, Kelantan</w:t>
+        <w:t>aimannhambalii@gmail.com | WhatsApp: +60 11-2550 7190 | Kota Bharu, Kelantan | Portfolio: amnhmb.my</w:t>
       </w:r>
     </w:p>
     <w:p>
@@ -402,6 +402,19 @@
         <w:t>Hosted visiting delegation from Fukuoka, Japan at Politeknik Ungku Omar during a student exchange program.</w:t>
       </w:r>
     </w:p>
+    <w:p>
+      <w:pPr>
+        <w:spacing w:before="80" w:after="0"/>
+        <w:jc w:val="center"/>
+      </w:pPr>
+      <w:r>
+        <w:rPr>
+          <w:i/>
+          <w:sz w:val="18"/>
+        </w:rPr>
+        <w:t>For full projects, research, and academic details, visit amnhmb.my</w:t>
+      </w:r>
+    </w:p>
     <w:sectPr>
       <w:pgSz w:w="11906" w:h="16838"/>
       <w:pgMar w:top="576" w:right="576" w:bottom="576" w:left="576" w:header="720" w:footer="720" w:gutter="0"/>

</xml_diff>

<commit_message>
docs(cv): add soft skills + languages, FIRA 2nd place
</commit_message>
<xml_diff>
--- a/public/Aiman_Hambali_CV.docx
+++ b/public/Aiman_Hambali_CV.docx
@@ -274,6 +274,32 @@
       <w:r>
         <w:t>React, Vite, Tailwind, Supabase, Cloudflare Pages</w:t>
       </w:r>
+      <w:r>
+        <w:rPr>
+          <w:b/>
+        </w:rPr>
+        <w:br/>
+        <w:t xml:space="preserve">Soft Skills: </w:t>
+      </w:r>
+      <w:r>
+        <w:rPr>
+          <w:b w:val="0"/>
+        </w:rPr>
+        <w:t>Teamwork, Mentoring &amp; Leadership, Problem Solving, Professional Maturity, Time Management, Continuous Learning</w:t>
+      </w:r>
+      <w:r>
+        <w:rPr>
+          <w:b/>
+        </w:rPr>
+        <w:br/>
+        <w:t xml:space="preserve">Languages: </w:t>
+      </w:r>
+      <w:r>
+        <w:rPr>
+          <w:b w:val="0"/>
+        </w:rPr>
+        <w:t>Bahasa Malaysia (Native), English (Intermediate)</w:t>
+      </w:r>
     </w:p>
     <w:p>
       <w:pPr>
@@ -389,7 +415,7 @@
         <w:ind w:left="288"/>
       </w:pPr>
       <w:r>
-        <w:t>FIRA 2019 Robotics Competition (Port Dickson)</w:t>
+        <w:t>2nd Place (Team), FIRA 2019 Robotics Competition, Port Dickson</w:t>
       </w:r>
     </w:p>
     <w:p>

</xml_diff>

<commit_message>
docs(cv): ThirtyOne Lab web projects year 2024 -> 2026
</commit_message>
<xml_diff>
--- a/public/Aiman_Hambali_CV.docx
+++ b/public/Aiman_Hambali_CV.docx
@@ -327,7 +327,7 @@
         <w:t>ThirtyOne Lab (Catalog &amp; Admin Panel)</w:t>
       </w:r>
       <w:r>
-        <w:t xml:space="preserve"> | Independent Web App | 31lab.pages.dev (2024)</w:t>
+        <w:t xml:space="preserve"> | Independent Web App | 31lab.pages.dev (2026)</w:t>
       </w:r>
     </w:p>
     <w:p>
@@ -351,7 +351,7 @@
         <w:t>ThirtyOne Lab (Order Management System)</w:t>
       </w:r>
       <w:r>
-        <w:t xml:space="preserve"> | Independent Web App (2024)</w:t>
+        <w:t xml:space="preserve"> | Independent Web App (2026)</w:t>
       </w:r>
     </w:p>
     <w:p>

</xml_diff>